<commit_message>
Auto sync: 2025-11-20 14:15:03
</commit_message>
<xml_diff>
--- a/TABLES/Table1_characteristics.docx
+++ b/TABLES/Table1_characteristics.docx
@@ -64,7 +64,6 @@
           </w:tcPr>
           <w:p>
             <w:pPr>
-              <w:pStyle w:val="Normal"/>
               <w:jc w:val="left"/>
               <w:pBdr>
                 <w:bottom w:val="none" w:sz="0" w:space="0" w:color="000000"/>
@@ -119,7 +118,6 @@
           </w:tcPr>
           <w:p>
             <w:pPr>
-              <w:pStyle w:val="Normal"/>
               <w:jc w:val="center"/>
               <w:pBdr>
                 <w:bottom w:val="none" w:sz="0" w:space="0" w:color="000000"/>
@@ -174,7 +172,6 @@
           </w:tcPr>
           <w:p>
             <w:pPr>
-              <w:pStyle w:val="Normal"/>
               <w:jc w:val="center"/>
               <w:pBdr>
                 <w:bottom w:val="none" w:sz="0" w:space="0" w:color="000000"/>
@@ -235,7 +232,6 @@
           </w:tcPr>
           <w:p>
             <w:pPr>
-              <w:pStyle w:val="Normal"/>
               <w:jc w:val="left"/>
               <w:pBdr>
                 <w:bottom w:val="none" w:sz="0" w:space="0" w:color="000000"/>
@@ -290,7 +286,6 @@
           </w:tcPr>
           <w:p>
             <w:pPr>
-              <w:pStyle w:val="Normal"/>
               <w:jc w:val="center"/>
               <w:pBdr>
                 <w:bottom w:val="none" w:sz="0" w:space="0" w:color="000000"/>
@@ -345,7 +340,6 @@
           </w:tcPr>
           <w:p>
             <w:pPr>
-              <w:pStyle w:val="Normal"/>
               <w:jc w:val="center"/>
               <w:pBdr>
                 <w:bottom w:val="none" w:sz="0" w:space="0" w:color="000000"/>
@@ -406,7 +400,6 @@
           </w:tcPr>
           <w:p>
             <w:pPr>
-              <w:pStyle w:val="Normal"/>
               <w:jc w:val="left"/>
               <w:pBdr>
                 <w:bottom w:val="none" w:sz="0" w:space="0" w:color="000000"/>
@@ -461,7 +454,6 @@
           </w:tcPr>
           <w:p>
             <w:pPr>
-              <w:pStyle w:val="Normal"/>
               <w:jc w:val="center"/>
               <w:pBdr>
                 <w:bottom w:val="none" w:sz="0" w:space="0" w:color="000000"/>
@@ -516,7 +508,6 @@
           </w:tcPr>
           <w:p>
             <w:pPr>
-              <w:pStyle w:val="Normal"/>
               <w:jc w:val="center"/>
               <w:pBdr>
                 <w:bottom w:val="none" w:sz="0" w:space="0" w:color="000000"/>
@@ -577,7 +568,6 @@
           </w:tcPr>
           <w:p>
             <w:pPr>
-              <w:pStyle w:val="Normal"/>
               <w:jc w:val="left"/>
               <w:pBdr>
                 <w:bottom w:val="none" w:sz="0" w:space="0" w:color="000000"/>
@@ -632,7 +622,6 @@
           </w:tcPr>
           <w:p>
             <w:pPr>
-              <w:pStyle w:val="Normal"/>
               <w:jc w:val="center"/>
               <w:pBdr>
                 <w:bottom w:val="none" w:sz="0" w:space="0" w:color="000000"/>
@@ -687,7 +676,6 @@
           </w:tcPr>
           <w:p>
             <w:pPr>
-              <w:pStyle w:val="Normal"/>
               <w:jc w:val="center"/>
               <w:pBdr>
                 <w:bottom w:val="none" w:sz="0" w:space="0" w:color="000000"/>
@@ -748,7 +736,6 @@
           </w:tcPr>
           <w:p>
             <w:pPr>
-              <w:pStyle w:val="Normal"/>
               <w:jc w:val="left"/>
               <w:pBdr>
                 <w:bottom w:val="none" w:sz="0" w:space="0" w:color="000000"/>
@@ -803,7 +790,6 @@
           </w:tcPr>
           <w:p>
             <w:pPr>
-              <w:pStyle w:val="Normal"/>
               <w:jc w:val="center"/>
               <w:pBdr>
                 <w:bottom w:val="none" w:sz="0" w:space="0" w:color="000000"/>
@@ -858,7 +844,6 @@
           </w:tcPr>
           <w:p>
             <w:pPr>
-              <w:pStyle w:val="Normal"/>
               <w:jc w:val="center"/>
               <w:pBdr>
                 <w:bottom w:val="none" w:sz="0" w:space="0" w:color="000000"/>
@@ -919,7 +904,6 @@
           </w:tcPr>
           <w:p>
             <w:pPr>
-              <w:pStyle w:val="Normal"/>
               <w:jc w:val="left"/>
               <w:pBdr>
                 <w:bottom w:val="none" w:sz="0" w:space="0" w:color="000000"/>
@@ -974,7 +958,6 @@
           </w:tcPr>
           <w:p>
             <w:pPr>
-              <w:pStyle w:val="Normal"/>
               <w:jc w:val="center"/>
               <w:pBdr>
                 <w:bottom w:val="none" w:sz="0" w:space="0" w:color="000000"/>
@@ -1029,7 +1012,6 @@
           </w:tcPr>
           <w:p>
             <w:pPr>
-              <w:pStyle w:val="Normal"/>
               <w:jc w:val="center"/>
               <w:pBdr>
                 <w:bottom w:val="none" w:sz="0" w:space="0" w:color="000000"/>
@@ -1090,7 +1072,6 @@
           </w:tcPr>
           <w:p>
             <w:pPr>
-              <w:pStyle w:val="Normal"/>
               <w:jc w:val="left"/>
               <w:pBdr>
                 <w:bottom w:val="none" w:sz="0" w:space="0" w:color="000000"/>
@@ -1145,7 +1126,6 @@
           </w:tcPr>
           <w:p>
             <w:pPr>
-              <w:pStyle w:val="Normal"/>
               <w:jc w:val="center"/>
               <w:pBdr>
                 <w:bottom w:val="none" w:sz="0" w:space="0" w:color="000000"/>
@@ -1200,7 +1180,6 @@
           </w:tcPr>
           <w:p>
             <w:pPr>
-              <w:pStyle w:val="Normal"/>
               <w:jc w:val="center"/>
               <w:pBdr>
                 <w:bottom w:val="none" w:sz="0" w:space="0" w:color="000000"/>
@@ -1261,7 +1240,6 @@
           </w:tcPr>
           <w:p>
             <w:pPr>
-              <w:pStyle w:val="Normal"/>
               <w:jc w:val="left"/>
               <w:pBdr>
                 <w:bottom w:val="none" w:sz="0" w:space="0" w:color="000000"/>
@@ -1316,7 +1294,6 @@
           </w:tcPr>
           <w:p>
             <w:pPr>
-              <w:pStyle w:val="Normal"/>
               <w:jc w:val="center"/>
               <w:pBdr>
                 <w:bottom w:val="none" w:sz="0" w:space="0" w:color="000000"/>
@@ -1371,7 +1348,6 @@
           </w:tcPr>
           <w:p>
             <w:pPr>
-              <w:pStyle w:val="Normal"/>
               <w:jc w:val="center"/>
               <w:pBdr>
                 <w:bottom w:val="none" w:sz="0" w:space="0" w:color="000000"/>
@@ -1432,7 +1408,6 @@
           </w:tcPr>
           <w:p>
             <w:pPr>
-              <w:pStyle w:val="Normal"/>
               <w:jc w:val="left"/>
               <w:pBdr>
                 <w:bottom w:val="none" w:sz="0" w:space="0" w:color="000000"/>
@@ -1487,7 +1462,6 @@
           </w:tcPr>
           <w:p>
             <w:pPr>
-              <w:pStyle w:val="Normal"/>
               <w:jc w:val="center"/>
               <w:pBdr>
                 <w:bottom w:val="none" w:sz="0" w:space="0" w:color="000000"/>
@@ -1542,7 +1516,6 @@
           </w:tcPr>
           <w:p>
             <w:pPr>
-              <w:pStyle w:val="Normal"/>
               <w:jc w:val="center"/>
               <w:pBdr>
                 <w:bottom w:val="none" w:sz="0" w:space="0" w:color="000000"/>
@@ -1603,7 +1576,6 @@
           </w:tcPr>
           <w:p>
             <w:pPr>
-              <w:pStyle w:val="Normal"/>
               <w:jc w:val="left"/>
               <w:pBdr>
                 <w:bottom w:val="none" w:sz="0" w:space="0" w:color="000000"/>
@@ -1658,7 +1630,6 @@
           </w:tcPr>
           <w:p>
             <w:pPr>
-              <w:pStyle w:val="Normal"/>
               <w:jc w:val="center"/>
               <w:pBdr>
                 <w:bottom w:val="none" w:sz="0" w:space="0" w:color="000000"/>
@@ -1713,7 +1684,6 @@
           </w:tcPr>
           <w:p>
             <w:pPr>
-              <w:pStyle w:val="Normal"/>
               <w:jc w:val="center"/>
               <w:pBdr>
                 <w:bottom w:val="none" w:sz="0" w:space="0" w:color="000000"/>
@@ -1774,7 +1744,6 @@
           </w:tcPr>
           <w:p>
             <w:pPr>
-              <w:pStyle w:val="Normal"/>
               <w:jc w:val="left"/>
               <w:pBdr>
                 <w:bottom w:val="none" w:sz="0" w:space="0" w:color="000000"/>
@@ -1829,7 +1798,6 @@
           </w:tcPr>
           <w:p>
             <w:pPr>
-              <w:pStyle w:val="Normal"/>
               <w:jc w:val="center"/>
               <w:pBdr>
                 <w:bottom w:val="none" w:sz="0" w:space="0" w:color="000000"/>
@@ -1884,7 +1852,6 @@
           </w:tcPr>
           <w:p>
             <w:pPr>
-              <w:pStyle w:val="Normal"/>
               <w:jc w:val="center"/>
               <w:pBdr>
                 <w:bottom w:val="none" w:sz="0" w:space="0" w:color="000000"/>
@@ -1945,7 +1912,6 @@
           </w:tcPr>
           <w:p>
             <w:pPr>
-              <w:pStyle w:val="Normal"/>
               <w:jc w:val="left"/>
               <w:pBdr>
                 <w:bottom w:val="none" w:sz="0" w:space="0" w:color="000000"/>
@@ -2000,7 +1966,6 @@
           </w:tcPr>
           <w:p>
             <w:pPr>
-              <w:pStyle w:val="Normal"/>
               <w:jc w:val="center"/>
               <w:pBdr>
                 <w:bottom w:val="none" w:sz="0" w:space="0" w:color="000000"/>
@@ -2055,7 +2020,6 @@
           </w:tcPr>
           <w:p>
             <w:pPr>
-              <w:pStyle w:val="Normal"/>
               <w:jc w:val="center"/>
               <w:pBdr>
                 <w:bottom w:val="none" w:sz="0" w:space="0" w:color="000000"/>
@@ -2116,7 +2080,6 @@
           </w:tcPr>
           <w:p>
             <w:pPr>
-              <w:pStyle w:val="Normal"/>
               <w:jc w:val="left"/>
               <w:pBdr>
                 <w:bottom w:val="none" w:sz="0" w:space="0" w:color="000000"/>
@@ -2171,7 +2134,6 @@
           </w:tcPr>
           <w:p>
             <w:pPr>
-              <w:pStyle w:val="Normal"/>
               <w:jc w:val="center"/>
               <w:pBdr>
                 <w:bottom w:val="none" w:sz="0" w:space="0" w:color="000000"/>
@@ -2226,7 +2188,6 @@
           </w:tcPr>
           <w:p>
             <w:pPr>
-              <w:pStyle w:val="Normal"/>
               <w:jc w:val="center"/>
               <w:pBdr>
                 <w:bottom w:val="none" w:sz="0" w:space="0" w:color="000000"/>
@@ -2287,7 +2248,6 @@
           </w:tcPr>
           <w:p>
             <w:pPr>
-              <w:pStyle w:val="Normal"/>
               <w:jc w:val="left"/>
               <w:pBdr>
                 <w:bottom w:val="none" w:sz="0" w:space="0" w:color="000000"/>
@@ -2342,7 +2302,6 @@
           </w:tcPr>
           <w:p>
             <w:pPr>
-              <w:pStyle w:val="Normal"/>
               <w:jc w:val="center"/>
               <w:pBdr>
                 <w:bottom w:val="none" w:sz="0" w:space="0" w:color="000000"/>
@@ -2397,7 +2356,6 @@
           </w:tcPr>
           <w:p>
             <w:pPr>
-              <w:pStyle w:val="Normal"/>
               <w:jc w:val="center"/>
               <w:pBdr>
                 <w:bottom w:val="none" w:sz="0" w:space="0" w:color="000000"/>
@@ -2458,7 +2416,6 @@
           </w:tcPr>
           <w:p>
             <w:pPr>
-              <w:pStyle w:val="Normal"/>
               <w:jc w:val="left"/>
               <w:pBdr>
                 <w:bottom w:val="none" w:sz="0" w:space="0" w:color="000000"/>
@@ -2513,7 +2470,6 @@
           </w:tcPr>
           <w:p>
             <w:pPr>
-              <w:pStyle w:val="Normal"/>
               <w:jc w:val="center"/>
               <w:pBdr>
                 <w:bottom w:val="none" w:sz="0" w:space="0" w:color="000000"/>
@@ -2568,7 +2524,6 @@
           </w:tcPr>
           <w:p>
             <w:pPr>
-              <w:pStyle w:val="Normal"/>
               <w:jc w:val="center"/>
               <w:pBdr>
                 <w:bottom w:val="none" w:sz="0" w:space="0" w:color="000000"/>
@@ -2629,7 +2584,6 @@
           </w:tcPr>
           <w:p>
             <w:pPr>
-              <w:pStyle w:val="Normal"/>
               <w:jc w:val="left"/>
               <w:pBdr>
                 <w:bottom w:val="none" w:sz="0" w:space="0" w:color="000000"/>
@@ -2684,7 +2638,6 @@
           </w:tcPr>
           <w:p>
             <w:pPr>
-              <w:pStyle w:val="Normal"/>
               <w:jc w:val="center"/>
               <w:pBdr>
                 <w:bottom w:val="none" w:sz="0" w:space="0" w:color="000000"/>
@@ -2739,7 +2692,6 @@
           </w:tcPr>
           <w:p>
             <w:pPr>
-              <w:pStyle w:val="Normal"/>
               <w:jc w:val="center"/>
               <w:pBdr>
                 <w:bottom w:val="none" w:sz="0" w:space="0" w:color="000000"/>
@@ -2800,7 +2752,6 @@
           </w:tcPr>
           <w:p>
             <w:pPr>
-              <w:pStyle w:val="Normal"/>
               <w:jc w:val="left"/>
               <w:pBdr>
                 <w:bottom w:val="none" w:sz="0" w:space="0" w:color="000000"/>
@@ -2855,7 +2806,6 @@
           </w:tcPr>
           <w:p>
             <w:pPr>
-              <w:pStyle w:val="Normal"/>
               <w:jc w:val="center"/>
               <w:pBdr>
                 <w:bottom w:val="none" w:sz="0" w:space="0" w:color="000000"/>
@@ -2910,7 +2860,6 @@
           </w:tcPr>
           <w:p>
             <w:pPr>
-              <w:pStyle w:val="Normal"/>
               <w:jc w:val="center"/>
               <w:pBdr>
                 <w:bottom w:val="none" w:sz="0" w:space="0" w:color="000000"/>
@@ -2971,7 +2920,6 @@
           </w:tcPr>
           <w:p>
             <w:pPr>
-              <w:pStyle w:val="Normal"/>
               <w:jc w:val="left"/>
               <w:pBdr>
                 <w:bottom w:val="none" w:sz="0" w:space="0" w:color="000000"/>
@@ -3026,7 +2974,6 @@
           </w:tcPr>
           <w:p>
             <w:pPr>
-              <w:pStyle w:val="Normal"/>
               <w:jc w:val="center"/>
               <w:pBdr>
                 <w:bottom w:val="none" w:sz="0" w:space="0" w:color="000000"/>
@@ -3081,7 +3028,6 @@
           </w:tcPr>
           <w:p>
             <w:pPr>
-              <w:pStyle w:val="Normal"/>
               <w:jc w:val="center"/>
               <w:pBdr>
                 <w:bottom w:val="none" w:sz="0" w:space="0" w:color="000000"/>
@@ -3142,7 +3088,6 @@
           </w:tcPr>
           <w:p>
             <w:pPr>
-              <w:pStyle w:val="Normal"/>
               <w:jc w:val="left"/>
               <w:pBdr>
                 <w:bottom w:val="none" w:sz="0" w:space="0" w:color="000000"/>
@@ -3197,7 +3142,6 @@
           </w:tcPr>
           <w:p>
             <w:pPr>
-              <w:pStyle w:val="Normal"/>
               <w:jc w:val="center"/>
               <w:pBdr>
                 <w:bottom w:val="none" w:sz="0" w:space="0" w:color="000000"/>
@@ -3252,7 +3196,6 @@
           </w:tcPr>
           <w:p>
             <w:pPr>
-              <w:pStyle w:val="Normal"/>
               <w:jc w:val="center"/>
               <w:pBdr>
                 <w:bottom w:val="none" w:sz="0" w:space="0" w:color="000000"/>
@@ -3313,7 +3256,6 @@
           </w:tcPr>
           <w:p>
             <w:pPr>
-              <w:pStyle w:val="Normal"/>
               <w:jc w:val="left"/>
               <w:pBdr>
                 <w:bottom w:val="none" w:sz="0" w:space="0" w:color="000000"/>
@@ -3368,7 +3310,6 @@
           </w:tcPr>
           <w:p>
             <w:pPr>
-              <w:pStyle w:val="Normal"/>
               <w:jc w:val="center"/>
               <w:pBdr>
                 <w:bottom w:val="none" w:sz="0" w:space="0" w:color="000000"/>
@@ -3423,7 +3364,6 @@
           </w:tcPr>
           <w:p>
             <w:pPr>
-              <w:pStyle w:val="Normal"/>
               <w:jc w:val="center"/>
               <w:pBdr>
                 <w:bottom w:val="none" w:sz="0" w:space="0" w:color="000000"/>
@@ -3484,7 +3424,6 @@
           </w:tcPr>
           <w:p>
             <w:pPr>
-              <w:pStyle w:val="Normal"/>
               <w:jc w:val="left"/>
               <w:pBdr>
                 <w:bottom w:val="none" w:sz="0" w:space="0" w:color="000000"/>
@@ -3539,7 +3478,6 @@
           </w:tcPr>
           <w:p>
             <w:pPr>
-              <w:pStyle w:val="Normal"/>
               <w:jc w:val="center"/>
               <w:pBdr>
                 <w:bottom w:val="none" w:sz="0" w:space="0" w:color="000000"/>
@@ -3594,7 +3532,6 @@
           </w:tcPr>
           <w:p>
             <w:pPr>
-              <w:pStyle w:val="Normal"/>
               <w:jc w:val="center"/>
               <w:pBdr>
                 <w:bottom w:val="none" w:sz="0" w:space="0" w:color="000000"/>
@@ -3655,7 +3592,6 @@
           </w:tcPr>
           <w:p>
             <w:pPr>
-              <w:pStyle w:val="Normal"/>
               <w:jc w:val="left"/>
               <w:pBdr>
                 <w:bottom w:val="none" w:sz="0" w:space="0" w:color="000000"/>
@@ -3710,7 +3646,6 @@
           </w:tcPr>
           <w:p>
             <w:pPr>
-              <w:pStyle w:val="Normal"/>
               <w:jc w:val="center"/>
               <w:pBdr>
                 <w:bottom w:val="none" w:sz="0" w:space="0" w:color="000000"/>
@@ -3765,7 +3700,6 @@
           </w:tcPr>
           <w:p>
             <w:pPr>
-              <w:pStyle w:val="Normal"/>
               <w:jc w:val="center"/>
               <w:pBdr>
                 <w:bottom w:val="none" w:sz="0" w:space="0" w:color="000000"/>
@@ -3826,7 +3760,6 @@
           </w:tcPr>
           <w:p>
             <w:pPr>
-              <w:pStyle w:val="Normal"/>
               <w:jc w:val="left"/>
               <w:pBdr>
                 <w:bottom w:val="none" w:sz="0" w:space="0" w:color="000000"/>
@@ -3881,7 +3814,6 @@
           </w:tcPr>
           <w:p>
             <w:pPr>
-              <w:pStyle w:val="Normal"/>
               <w:jc w:val="center"/>
               <w:pBdr>
                 <w:bottom w:val="none" w:sz="0" w:space="0" w:color="000000"/>
@@ -3936,7 +3868,6 @@
           </w:tcPr>
           <w:p>
             <w:pPr>
-              <w:pStyle w:val="Normal"/>
               <w:jc w:val="center"/>
               <w:pBdr>
                 <w:bottom w:val="none" w:sz="0" w:space="0" w:color="000000"/>
@@ -3997,7 +3928,6 @@
           </w:tcPr>
           <w:p>
             <w:pPr>
-              <w:pStyle w:val="Normal"/>
               <w:jc w:val="left"/>
               <w:pBdr>
                 <w:bottom w:val="none" w:sz="0" w:space="0" w:color="000000"/>
@@ -4052,7 +3982,6 @@
           </w:tcPr>
           <w:p>
             <w:pPr>
-              <w:pStyle w:val="Normal"/>
               <w:jc w:val="center"/>
               <w:pBdr>
                 <w:bottom w:val="none" w:sz="0" w:space="0" w:color="000000"/>
@@ -4107,7 +4036,6 @@
           </w:tcPr>
           <w:p>
             <w:pPr>
-              <w:pStyle w:val="Normal"/>
               <w:jc w:val="center"/>
               <w:pBdr>
                 <w:bottom w:val="none" w:sz="0" w:space="0" w:color="000000"/>
@@ -4168,7 +4096,6 @@
           </w:tcPr>
           <w:p>
             <w:pPr>
-              <w:pStyle w:val="Normal"/>
               <w:jc w:val="left"/>
               <w:pBdr>
                 <w:bottom w:val="none" w:sz="0" w:space="0" w:color="000000"/>
@@ -4223,7 +4150,6 @@
           </w:tcPr>
           <w:p>
             <w:pPr>
-              <w:pStyle w:val="Normal"/>
               <w:jc w:val="center"/>
               <w:pBdr>
                 <w:bottom w:val="none" w:sz="0" w:space="0" w:color="000000"/>
@@ -4278,7 +4204,6 @@
           </w:tcPr>
           <w:p>
             <w:pPr>
-              <w:pStyle w:val="Normal"/>
               <w:jc w:val="center"/>
               <w:pBdr>
                 <w:bottom w:val="none" w:sz="0" w:space="0" w:color="000000"/>
@@ -4339,7 +4264,6 @@
           </w:tcPr>
           <w:p>
             <w:pPr>
-              <w:pStyle w:val="Normal"/>
               <w:jc w:val="left"/>
               <w:pBdr>
                 <w:bottom w:val="none" w:sz="0" w:space="0" w:color="000000"/>
@@ -4394,7 +4318,6 @@
           </w:tcPr>
           <w:p>
             <w:pPr>
-              <w:pStyle w:val="Normal"/>
               <w:jc w:val="center"/>
               <w:pBdr>
                 <w:bottom w:val="none" w:sz="0" w:space="0" w:color="000000"/>
@@ -4449,7 +4372,6 @@
           </w:tcPr>
           <w:p>
             <w:pPr>
-              <w:pStyle w:val="Normal"/>
               <w:jc w:val="center"/>
               <w:pBdr>
                 <w:bottom w:val="none" w:sz="0" w:space="0" w:color="000000"/>
@@ -4510,7 +4432,6 @@
           </w:tcPr>
           <w:p>
             <w:pPr>
-              <w:pStyle w:val="Normal"/>
               <w:jc w:val="left"/>
               <w:pBdr>
                 <w:bottom w:val="none" w:sz="0" w:space="0" w:color="000000"/>
@@ -4565,7 +4486,6 @@
           </w:tcPr>
           <w:p>
             <w:pPr>
-              <w:pStyle w:val="Normal"/>
               <w:jc w:val="center"/>
               <w:pBdr>
                 <w:bottom w:val="none" w:sz="0" w:space="0" w:color="000000"/>
@@ -4620,7 +4540,6 @@
           </w:tcPr>
           <w:p>
             <w:pPr>
-              <w:pStyle w:val="Normal"/>
               <w:jc w:val="center"/>
               <w:pBdr>
                 <w:bottom w:val="none" w:sz="0" w:space="0" w:color="000000"/>
@@ -4681,7 +4600,6 @@
           </w:tcPr>
           <w:p>
             <w:pPr>
-              <w:pStyle w:val="Normal"/>
               <w:jc w:val="left"/>
               <w:pBdr>
                 <w:bottom w:val="none" w:sz="0" w:space="0" w:color="000000"/>
@@ -4736,7 +4654,6 @@
           </w:tcPr>
           <w:p>
             <w:pPr>
-              <w:pStyle w:val="Normal"/>
               <w:jc w:val="center"/>
               <w:pBdr>
                 <w:bottom w:val="none" w:sz="0" w:space="0" w:color="000000"/>
@@ -4791,7 +4708,6 @@
           </w:tcPr>
           <w:p>
             <w:pPr>
-              <w:pStyle w:val="Normal"/>
               <w:jc w:val="center"/>
               <w:pBdr>
                 <w:bottom w:val="none" w:sz="0" w:space="0" w:color="000000"/>
@@ -4852,7 +4768,6 @@
           </w:tcPr>
           <w:p>
             <w:pPr>
-              <w:pStyle w:val="Normal"/>
               <w:jc w:val="left"/>
               <w:pBdr>
                 <w:bottom w:val="none" w:sz="0" w:space="0" w:color="000000"/>
@@ -4907,7 +4822,6 @@
           </w:tcPr>
           <w:p>
             <w:pPr>
-              <w:pStyle w:val="Normal"/>
               <w:jc w:val="center"/>
               <w:pBdr>
                 <w:bottom w:val="none" w:sz="0" w:space="0" w:color="000000"/>
@@ -4962,7 +4876,6 @@
           </w:tcPr>
           <w:p>
             <w:pPr>
-              <w:pStyle w:val="Normal"/>
               <w:jc w:val="center"/>
               <w:pBdr>
                 <w:bottom w:val="none" w:sz="0" w:space="0" w:color="000000"/>
@@ -5023,7 +4936,6 @@
           </w:tcPr>
           <w:p>
             <w:pPr>
-              <w:pStyle w:val="Normal"/>
               <w:jc w:val="left"/>
               <w:pBdr>
                 <w:bottom w:val="none" w:sz="0" w:space="0" w:color="000000"/>
@@ -5078,7 +4990,6 @@
           </w:tcPr>
           <w:p>
             <w:pPr>
-              <w:pStyle w:val="Normal"/>
               <w:jc w:val="center"/>
               <w:pBdr>
                 <w:bottom w:val="none" w:sz="0" w:space="0" w:color="000000"/>
@@ -5133,7 +5044,6 @@
           </w:tcPr>
           <w:p>
             <w:pPr>
-              <w:pStyle w:val="Normal"/>
               <w:jc w:val="center"/>
               <w:pBdr>
                 <w:bottom w:val="none" w:sz="0" w:space="0" w:color="000000"/>
@@ -5194,7 +5104,6 @@
           </w:tcPr>
           <w:p>
             <w:pPr>
-              <w:pStyle w:val="Normal"/>
               <w:jc w:val="left"/>
               <w:pBdr>
                 <w:bottom w:val="none" w:sz="0" w:space="0" w:color="000000"/>
@@ -5249,7 +5158,6 @@
           </w:tcPr>
           <w:p>
             <w:pPr>
-              <w:pStyle w:val="Normal"/>
               <w:jc w:val="center"/>
               <w:pBdr>
                 <w:bottom w:val="none" w:sz="0" w:space="0" w:color="000000"/>
@@ -5304,7 +5212,6 @@
           </w:tcPr>
           <w:p>
             <w:pPr>
-              <w:pStyle w:val="Normal"/>
               <w:jc w:val="center"/>
               <w:pBdr>
                 <w:bottom w:val="none" w:sz="0" w:space="0" w:color="000000"/>
@@ -5365,7 +5272,6 @@
           </w:tcPr>
           <w:p>
             <w:pPr>
-              <w:pStyle w:val="Normal"/>
               <w:jc w:val="left"/>
               <w:pBdr>
                 <w:bottom w:val="none" w:sz="0" w:space="0" w:color="000000"/>
@@ -5420,7 +5326,6 @@
           </w:tcPr>
           <w:p>
             <w:pPr>
-              <w:pStyle w:val="Normal"/>
               <w:jc w:val="center"/>
               <w:pBdr>
                 <w:bottom w:val="none" w:sz="0" w:space="0" w:color="000000"/>
@@ -5475,7 +5380,6 @@
           </w:tcPr>
           <w:p>
             <w:pPr>
-              <w:pStyle w:val="Normal"/>
               <w:jc w:val="center"/>
               <w:pBdr>
                 <w:bottom w:val="none" w:sz="0" w:space="0" w:color="000000"/>
@@ -5536,7 +5440,6 @@
           </w:tcPr>
           <w:p>
             <w:pPr>
-              <w:pStyle w:val="Normal"/>
               <w:jc w:val="left"/>
               <w:pBdr>
                 <w:bottom w:val="none" w:sz="0" w:space="0" w:color="000000"/>
@@ -5591,7 +5494,6 @@
           </w:tcPr>
           <w:p>
             <w:pPr>
-              <w:pStyle w:val="Normal"/>
               <w:jc w:val="center"/>
               <w:pBdr>
                 <w:bottom w:val="none" w:sz="0" w:space="0" w:color="000000"/>
@@ -5646,7 +5548,6 @@
           </w:tcPr>
           <w:p>
             <w:pPr>
-              <w:pStyle w:val="Normal"/>
               <w:jc w:val="center"/>
               <w:pBdr>
                 <w:bottom w:val="none" w:sz="0" w:space="0" w:color="000000"/>
@@ -5707,7 +5608,6 @@
           </w:tcPr>
           <w:p>
             <w:pPr>
-              <w:pStyle w:val="Normal"/>
               <w:jc w:val="left"/>
               <w:pBdr>
                 <w:bottom w:val="none" w:sz="0" w:space="0" w:color="000000"/>
@@ -5762,7 +5662,6 @@
           </w:tcPr>
           <w:p>
             <w:pPr>
-              <w:pStyle w:val="Normal"/>
               <w:jc w:val="center"/>
               <w:pBdr>
                 <w:bottom w:val="none" w:sz="0" w:space="0" w:color="000000"/>
@@ -5817,7 +5716,6 @@
           </w:tcPr>
           <w:p>
             <w:pPr>
-              <w:pStyle w:val="Normal"/>
               <w:jc w:val="center"/>
               <w:pBdr>
                 <w:bottom w:val="none" w:sz="0" w:space="0" w:color="000000"/>
@@ -5878,7 +5776,6 @@
           </w:tcPr>
           <w:p>
             <w:pPr>
-              <w:pStyle w:val="Normal"/>
               <w:jc w:val="left"/>
               <w:pBdr>
                 <w:bottom w:val="none" w:sz="0" w:space="0" w:color="000000"/>
@@ -5933,7 +5830,6 @@
           </w:tcPr>
           <w:p>
             <w:pPr>
-              <w:pStyle w:val="Normal"/>
               <w:jc w:val="center"/>
               <w:pBdr>
                 <w:bottom w:val="none" w:sz="0" w:space="0" w:color="000000"/>
@@ -5988,7 +5884,6 @@
           </w:tcPr>
           <w:p>
             <w:pPr>
-              <w:pStyle w:val="Normal"/>
               <w:jc w:val="center"/>
               <w:pBdr>
                 <w:bottom w:val="none" w:sz="0" w:space="0" w:color="000000"/>
@@ -6049,7 +5944,6 @@
           </w:tcPr>
           <w:p>
             <w:pPr>
-              <w:pStyle w:val="Normal"/>
               <w:jc w:val="left"/>
               <w:pBdr>
                 <w:bottom w:val="none" w:sz="0" w:space="0" w:color="000000"/>
@@ -6104,7 +5998,6 @@
           </w:tcPr>
           <w:p>
             <w:pPr>
-              <w:pStyle w:val="Normal"/>
               <w:jc w:val="center"/>
               <w:pBdr>
                 <w:bottom w:val="none" w:sz="0" w:space="0" w:color="000000"/>
@@ -6159,7 +6052,6 @@
           </w:tcPr>
           <w:p>
             <w:pPr>
-              <w:pStyle w:val="Normal"/>
               <w:jc w:val="center"/>
               <w:pBdr>
                 <w:bottom w:val="none" w:sz="0" w:space="0" w:color="000000"/>
@@ -6220,7 +6112,6 @@
           </w:tcPr>
           <w:p>
             <w:pPr>
-              <w:pStyle w:val="Normal"/>
               <w:jc w:val="left"/>
               <w:pBdr>
                 <w:bottom w:val="none" w:sz="0" w:space="0" w:color="000000"/>
@@ -6275,7 +6166,6 @@
           </w:tcPr>
           <w:p>
             <w:pPr>
-              <w:pStyle w:val="Normal"/>
               <w:jc w:val="center"/>
               <w:pBdr>
                 <w:bottom w:val="none" w:sz="0" w:space="0" w:color="000000"/>
@@ -6330,7 +6220,6 @@
           </w:tcPr>
           <w:p>
             <w:pPr>
-              <w:pStyle w:val="Normal"/>
               <w:jc w:val="center"/>
               <w:pBdr>
                 <w:bottom w:val="none" w:sz="0" w:space="0" w:color="000000"/>
@@ -6391,7 +6280,6 @@
           </w:tcPr>
           <w:p>
             <w:pPr>
-              <w:pStyle w:val="Normal"/>
               <w:jc w:val="left"/>
               <w:pBdr>
                 <w:bottom w:val="none" w:sz="0" w:space="0" w:color="000000"/>
@@ -6446,7 +6334,6 @@
           </w:tcPr>
           <w:p>
             <w:pPr>
-              <w:pStyle w:val="Normal"/>
               <w:jc w:val="center"/>
               <w:pBdr>
                 <w:bottom w:val="none" w:sz="0" w:space="0" w:color="000000"/>
@@ -6501,7 +6388,6 @@
           </w:tcPr>
           <w:p>
             <w:pPr>
-              <w:pStyle w:val="Normal"/>
               <w:jc w:val="center"/>
               <w:pBdr>
                 <w:bottom w:val="none" w:sz="0" w:space="0" w:color="000000"/>
@@ -6562,7 +6448,6 @@
           </w:tcPr>
           <w:p>
             <w:pPr>
-              <w:pStyle w:val="Normal"/>
               <w:jc w:val="left"/>
               <w:pBdr>
                 <w:bottom w:val="none" w:sz="0" w:space="0" w:color="000000"/>
@@ -6617,7 +6502,6 @@
           </w:tcPr>
           <w:p>
             <w:pPr>
-              <w:pStyle w:val="Normal"/>
               <w:jc w:val="center"/>
               <w:pBdr>
                 <w:bottom w:val="none" w:sz="0" w:space="0" w:color="000000"/>
@@ -6672,7 +6556,6 @@
           </w:tcPr>
           <w:p>
             <w:pPr>
-              <w:pStyle w:val="Normal"/>
               <w:jc w:val="center"/>
               <w:pBdr>
                 <w:bottom w:val="none" w:sz="0" w:space="0" w:color="000000"/>
@@ -6733,7 +6616,6 @@
           </w:tcPr>
           <w:p>
             <w:pPr>
-              <w:pStyle w:val="Normal"/>
               <w:jc w:val="left"/>
               <w:pBdr>
                 <w:bottom w:val="none" w:sz="0" w:space="0" w:color="000000"/>
@@ -6788,7 +6670,6 @@
           </w:tcPr>
           <w:p>
             <w:pPr>
-              <w:pStyle w:val="Normal"/>
               <w:jc w:val="center"/>
               <w:pBdr>
                 <w:bottom w:val="none" w:sz="0" w:space="0" w:color="000000"/>
@@ -6843,7 +6724,6 @@
           </w:tcPr>
           <w:p>
             <w:pPr>
-              <w:pStyle w:val="Normal"/>
               <w:jc w:val="center"/>
               <w:pBdr>
                 <w:bottom w:val="none" w:sz="0" w:space="0" w:color="000000"/>
@@ -6904,7 +6784,6 @@
           </w:tcPr>
           <w:p>
             <w:pPr>
-              <w:pStyle w:val="Normal"/>
               <w:jc w:val="left"/>
               <w:pBdr>
                 <w:bottom w:val="none" w:sz="0" w:space="0" w:color="000000"/>
@@ -6959,7 +6838,6 @@
           </w:tcPr>
           <w:p>
             <w:pPr>
-              <w:pStyle w:val="Normal"/>
               <w:jc w:val="center"/>
               <w:pBdr>
                 <w:bottom w:val="none" w:sz="0" w:space="0" w:color="000000"/>
@@ -7014,7 +6892,6 @@
           </w:tcPr>
           <w:p>
             <w:pPr>
-              <w:pStyle w:val="Normal"/>
               <w:jc w:val="center"/>
               <w:pBdr>
                 <w:bottom w:val="none" w:sz="0" w:space="0" w:color="000000"/>
@@ -7075,7 +6952,6 @@
           </w:tcPr>
           <w:p>
             <w:pPr>
-              <w:pStyle w:val="Normal"/>
               <w:jc w:val="left"/>
               <w:pBdr>
                 <w:bottom w:val="none" w:sz="0" w:space="0" w:color="000000"/>
@@ -7130,7 +7006,6 @@
           </w:tcPr>
           <w:p>
             <w:pPr>
-              <w:pStyle w:val="Normal"/>
               <w:jc w:val="center"/>
               <w:pBdr>
                 <w:bottom w:val="none" w:sz="0" w:space="0" w:color="000000"/>
@@ -7185,7 +7060,6 @@
           </w:tcPr>
           <w:p>
             <w:pPr>
-              <w:pStyle w:val="Normal"/>
               <w:jc w:val="center"/>
               <w:pBdr>
                 <w:bottom w:val="none" w:sz="0" w:space="0" w:color="000000"/>
@@ -7246,7 +7120,6 @@
           </w:tcPr>
           <w:p>
             <w:pPr>
-              <w:pStyle w:val="Normal"/>
               <w:jc w:val="left"/>
               <w:pBdr>
                 <w:bottom w:val="none" w:sz="0" w:space="0" w:color="000000"/>
@@ -7301,7 +7174,6 @@
           </w:tcPr>
           <w:p>
             <w:pPr>
-              <w:pStyle w:val="Normal"/>
               <w:jc w:val="center"/>
               <w:pBdr>
                 <w:bottom w:val="none" w:sz="0" w:space="0" w:color="000000"/>
@@ -7356,7 +7228,6 @@
           </w:tcPr>
           <w:p>
             <w:pPr>
-              <w:pStyle w:val="Normal"/>
               <w:jc w:val="center"/>
               <w:pBdr>
                 <w:bottom w:val="none" w:sz="0" w:space="0" w:color="000000"/>
@@ -7417,7 +7288,6 @@
           </w:tcPr>
           <w:p>
             <w:pPr>
-              <w:pStyle w:val="Normal"/>
               <w:jc w:val="left"/>
               <w:pBdr>
                 <w:bottom w:val="none" w:sz="0" w:space="0" w:color="000000"/>
@@ -7472,7 +7342,6 @@
           </w:tcPr>
           <w:p>
             <w:pPr>
-              <w:pStyle w:val="Normal"/>
               <w:jc w:val="center"/>
               <w:pBdr>
                 <w:bottom w:val="none" w:sz="0" w:space="0" w:color="000000"/>
@@ -7527,7 +7396,6 @@
           </w:tcPr>
           <w:p>
             <w:pPr>
-              <w:pStyle w:val="Normal"/>
               <w:jc w:val="center"/>
               <w:pBdr>
                 <w:bottom w:val="none" w:sz="0" w:space="0" w:color="000000"/>
@@ -7588,7 +7456,6 @@
           </w:tcPr>
           <w:p>
             <w:pPr>
-              <w:pStyle w:val="Normal"/>
               <w:jc w:val="left"/>
               <w:pBdr>
                 <w:bottom w:val="none" w:sz="0" w:space="0" w:color="000000"/>
@@ -7643,7 +7510,6 @@
           </w:tcPr>
           <w:p>
             <w:pPr>
-              <w:pStyle w:val="Normal"/>
               <w:jc w:val="center"/>
               <w:pBdr>
                 <w:bottom w:val="none" w:sz="0" w:space="0" w:color="000000"/>
@@ -7698,7 +7564,6 @@
           </w:tcPr>
           <w:p>
             <w:pPr>
-              <w:pStyle w:val="Normal"/>
               <w:jc w:val="center"/>
               <w:pBdr>
                 <w:bottom w:val="none" w:sz="0" w:space="0" w:color="000000"/>
@@ -7759,7 +7624,6 @@
           </w:tcPr>
           <w:p>
             <w:pPr>
-              <w:pStyle w:val="Normal"/>
               <w:jc w:val="left"/>
               <w:pBdr>
                 <w:bottom w:val="none" w:sz="0" w:space="0" w:color="000000"/>
@@ -7814,7 +7678,6 @@
           </w:tcPr>
           <w:p>
             <w:pPr>
-              <w:pStyle w:val="Normal"/>
               <w:jc w:val="center"/>
               <w:pBdr>
                 <w:bottom w:val="none" w:sz="0" w:space="0" w:color="000000"/>
@@ -7869,7 +7732,6 @@
           </w:tcPr>
           <w:p>
             <w:pPr>
-              <w:pStyle w:val="Normal"/>
               <w:jc w:val="center"/>
               <w:pBdr>
                 <w:bottom w:val="none" w:sz="0" w:space="0" w:color="000000"/>
@@ -7930,7 +7792,6 @@
           </w:tcPr>
           <w:p>
             <w:pPr>
-              <w:pStyle w:val="Normal"/>
               <w:jc w:val="left"/>
               <w:pBdr>
                 <w:bottom w:val="none" w:sz="0" w:space="0" w:color="000000"/>
@@ -7985,7 +7846,6 @@
           </w:tcPr>
           <w:p>
             <w:pPr>
-              <w:pStyle w:val="Normal"/>
               <w:jc w:val="center"/>
               <w:pBdr>
                 <w:bottom w:val="none" w:sz="0" w:space="0" w:color="000000"/>
@@ -8040,7 +7900,6 @@
           </w:tcPr>
           <w:p>
             <w:pPr>
-              <w:pStyle w:val="Normal"/>
               <w:jc w:val="center"/>
               <w:pBdr>
                 <w:bottom w:val="none" w:sz="0" w:space="0" w:color="000000"/>
@@ -8101,7 +7960,6 @@
           </w:tcPr>
           <w:p>
             <w:pPr>
-              <w:pStyle w:val="Normal"/>
               <w:jc w:val="left"/>
               <w:pBdr>
                 <w:bottom w:val="none" w:sz="0" w:space="0" w:color="000000"/>
@@ -8156,7 +8014,6 @@
           </w:tcPr>
           <w:p>
             <w:pPr>
-              <w:pStyle w:val="Normal"/>
               <w:jc w:val="center"/>
               <w:pBdr>
                 <w:bottom w:val="none" w:sz="0" w:space="0" w:color="000000"/>
@@ -8211,7 +8068,6 @@
           </w:tcPr>
           <w:p>
             <w:pPr>
-              <w:pStyle w:val="Normal"/>
               <w:jc w:val="center"/>
               <w:pBdr>
                 <w:bottom w:val="none" w:sz="0" w:space="0" w:color="000000"/>
@@ -8272,7 +8128,6 @@
           </w:tcPr>
           <w:p>
             <w:pPr>
-              <w:pStyle w:val="Normal"/>
               <w:jc w:val="left"/>
               <w:pBdr>
                 <w:bottom w:val="none" w:sz="0" w:space="0" w:color="000000"/>
@@ -8327,7 +8182,6 @@
           </w:tcPr>
           <w:p>
             <w:pPr>
-              <w:pStyle w:val="Normal"/>
               <w:jc w:val="center"/>
               <w:pBdr>
                 <w:bottom w:val="none" w:sz="0" w:space="0" w:color="000000"/>
@@ -8382,7 +8236,6 @@
           </w:tcPr>
           <w:p>
             <w:pPr>
-              <w:pStyle w:val="Normal"/>
               <w:jc w:val="center"/>
               <w:pBdr>
                 <w:bottom w:val="none" w:sz="0" w:space="0" w:color="000000"/>
@@ -8443,7 +8296,6 @@
           </w:tcPr>
           <w:p>
             <w:pPr>
-              <w:pStyle w:val="Normal"/>
               <w:jc w:val="left"/>
               <w:pBdr>
                 <w:bottom w:val="none" w:sz="0" w:space="0" w:color="000000"/>
@@ -8498,7 +8350,6 @@
           </w:tcPr>
           <w:p>
             <w:pPr>
-              <w:pStyle w:val="Normal"/>
               <w:jc w:val="center"/>
               <w:pBdr>
                 <w:bottom w:val="none" w:sz="0" w:space="0" w:color="000000"/>
@@ -8553,7 +8404,6 @@
           </w:tcPr>
           <w:p>
             <w:pPr>
-              <w:pStyle w:val="Normal"/>
               <w:jc w:val="center"/>
               <w:pBdr>
                 <w:bottom w:val="none" w:sz="0" w:space="0" w:color="000000"/>
@@ -8614,7 +8464,6 @@
           </w:tcPr>
           <w:p>
             <w:pPr>
-              <w:pStyle w:val="Normal"/>
               <w:jc w:val="left"/>
               <w:pBdr>
                 <w:bottom w:val="none" w:sz="0" w:space="0" w:color="000000"/>
@@ -8669,7 +8518,6 @@
           </w:tcPr>
           <w:p>
             <w:pPr>
-              <w:pStyle w:val="Normal"/>
               <w:jc w:val="center"/>
               <w:pBdr>
                 <w:bottom w:val="none" w:sz="0" w:space="0" w:color="000000"/>
@@ -8724,7 +8572,6 @@
           </w:tcPr>
           <w:p>
             <w:pPr>
-              <w:pStyle w:val="Normal"/>
               <w:jc w:val="center"/>
               <w:pBdr>
                 <w:bottom w:val="none" w:sz="0" w:space="0" w:color="000000"/>
@@ -8785,7 +8632,6 @@
           </w:tcPr>
           <w:p>
             <w:pPr>
-              <w:pStyle w:val="Normal"/>
               <w:jc w:val="left"/>
               <w:pBdr>
                 <w:bottom w:val="none" w:sz="0" w:space="0" w:color="000000"/>
@@ -8840,7 +8686,6 @@
           </w:tcPr>
           <w:p>
             <w:pPr>
-              <w:pStyle w:val="Normal"/>
               <w:jc w:val="center"/>
               <w:pBdr>
                 <w:bottom w:val="none" w:sz="0" w:space="0" w:color="000000"/>
@@ -8895,7 +8740,6 @@
           </w:tcPr>
           <w:p>
             <w:pPr>
-              <w:pStyle w:val="Normal"/>
               <w:jc w:val="center"/>
               <w:pBdr>
                 <w:bottom w:val="none" w:sz="0" w:space="0" w:color="000000"/>
@@ -8956,7 +8800,6 @@
           </w:tcPr>
           <w:p>
             <w:pPr>
-              <w:pStyle w:val="Normal"/>
               <w:jc w:val="left"/>
               <w:pBdr>
                 <w:bottom w:val="none" w:sz="0" w:space="0" w:color="000000"/>
@@ -9011,7 +8854,6 @@
           </w:tcPr>
           <w:p>
             <w:pPr>
-              <w:pStyle w:val="Normal"/>
               <w:jc w:val="center"/>
               <w:pBdr>
                 <w:bottom w:val="none" w:sz="0" w:space="0" w:color="000000"/>
@@ -9066,7 +8908,6 @@
           </w:tcPr>
           <w:p>
             <w:pPr>
-              <w:pStyle w:val="Normal"/>
               <w:jc w:val="center"/>
               <w:pBdr>
                 <w:bottom w:val="none" w:sz="0" w:space="0" w:color="000000"/>
@@ -9127,7 +8968,6 @@
           </w:tcPr>
           <w:p>
             <w:pPr>
-              <w:pStyle w:val="Normal"/>
               <w:jc w:val="left"/>
               <w:pBdr>
                 <w:bottom w:val="none" w:sz="0" w:space="0" w:color="000000"/>
@@ -9182,7 +9022,6 @@
           </w:tcPr>
           <w:p>
             <w:pPr>
-              <w:pStyle w:val="Normal"/>
               <w:jc w:val="center"/>
               <w:pBdr>
                 <w:bottom w:val="none" w:sz="0" w:space="0" w:color="000000"/>
@@ -9237,7 +9076,6 @@
           </w:tcPr>
           <w:p>
             <w:pPr>
-              <w:pStyle w:val="Normal"/>
               <w:jc w:val="center"/>
               <w:pBdr>
                 <w:bottom w:val="none" w:sz="0" w:space="0" w:color="000000"/>
@@ -9298,7 +9136,6 @@
           </w:tcPr>
           <w:p>
             <w:pPr>
-              <w:pStyle w:val="Normal"/>
               <w:jc w:val="left"/>
               <w:pBdr>
                 <w:bottom w:val="none" w:sz="0" w:space="0" w:color="000000"/>
@@ -9353,7 +9190,6 @@
           </w:tcPr>
           <w:p>
             <w:pPr>
-              <w:pStyle w:val="Normal"/>
               <w:jc w:val="center"/>
               <w:pBdr>
                 <w:bottom w:val="none" w:sz="0" w:space="0" w:color="000000"/>
@@ -9408,7 +9244,6 @@
           </w:tcPr>
           <w:p>
             <w:pPr>
-              <w:pStyle w:val="Normal"/>
               <w:jc w:val="center"/>
               <w:pBdr>
                 <w:bottom w:val="none" w:sz="0" w:space="0" w:color="000000"/>
@@ -9469,7 +9304,6 @@
           </w:tcPr>
           <w:p>
             <w:pPr>
-              <w:pStyle w:val="Normal"/>
               <w:jc w:val="left"/>
               <w:pBdr>
                 <w:bottom w:val="none" w:sz="0" w:space="0" w:color="000000"/>
@@ -9524,7 +9358,6 @@
           </w:tcPr>
           <w:p>
             <w:pPr>
-              <w:pStyle w:val="Normal"/>
               <w:jc w:val="center"/>
               <w:pBdr>
                 <w:bottom w:val="none" w:sz="0" w:space="0" w:color="000000"/>
@@ -9579,7 +9412,6 @@
           </w:tcPr>
           <w:p>
             <w:pPr>
-              <w:pStyle w:val="Normal"/>
               <w:jc w:val="center"/>
               <w:pBdr>
                 <w:bottom w:val="none" w:sz="0" w:space="0" w:color="000000"/>
@@ -9640,7 +9472,6 @@
           </w:tcPr>
           <w:p>
             <w:pPr>
-              <w:pStyle w:val="Normal"/>
               <w:jc w:val="left"/>
               <w:pBdr>
                 <w:bottom w:val="none" w:sz="0" w:space="0" w:color="000000"/>
@@ -9695,7 +9526,6 @@
           </w:tcPr>
           <w:p>
             <w:pPr>
-              <w:pStyle w:val="Normal"/>
               <w:jc w:val="center"/>
               <w:pBdr>
                 <w:bottom w:val="none" w:sz="0" w:space="0" w:color="000000"/>
@@ -9750,7 +9580,6 @@
           </w:tcPr>
           <w:p>
             <w:pPr>
-              <w:pStyle w:val="Normal"/>
               <w:jc w:val="center"/>
               <w:pBdr>
                 <w:bottom w:val="none" w:sz="0" w:space="0" w:color="000000"/>
@@ -9790,7 +9619,7 @@
     </w:tbl>
     <w:sectPr>
       <w:pgMar w:header="708" w:bottom="1417" w:top="1417" w:right="1417" w:left="1417" w:footer="708" w:gutter="0"/>
-      <w:pgSz w:h="16848" w:w="11952" w:orient="portrait"/>
+      <w:pgSz w:h="16838" w:w="11906" w:orient="portrait"/>
       <w:type w:val="continuous"/>
       <w:cols/>
     </w:sectPr>

</xml_diff>